<commit_message>
2.3-§: MHXS asosidagi kapital monandligi rasmiy RWA bo‘yicha qayta hisoblandi (taxminiy qiymatlar o‘rniga)
Co-Authored-By: Claude Opus 5.5 <noreply@anthropic.com>
Claude-Session: https://claude.ai/code/session_01PxHTC8Q7yHdrpAeUA5KUgM
</commit_message>
<xml_diff>
--- a/paragraflar/2.3-paragraf.docx
+++ b/paragraflar/2.3-paragraf.docx
@@ -2,7 +2,7 @@
 <file path=word/document.xml><?xml version="1.0" encoding="utf-8"?>
 <w:document xmlns:w="http://schemas.openxmlformats.org/wordprocessingml/2006/main" xmlns:m="http://schemas.openxmlformats.org/officeDocument/2006/math" xmlns:r="http://schemas.openxmlformats.org/officeDocument/2006/relationships" xmlns:o="urn:schemas-microsoft-com:office:office" xmlns:v="urn:schemas-microsoft-com:vml" xmlns:w10="urn:schemas-microsoft-com:office:word" xmlns:a="http://schemas.openxmlformats.org/drawingml/2006/main" xmlns:pic="http://schemas.openxmlformats.org/drawingml/2006/picture" xmlns:wp="http://schemas.openxmlformats.org/drawingml/2006/wordprocessingDrawing">
   <w:body>
-    <w:bookmarkStart w:id="56" w:name="Xbcd6da71180214302fa2c75f57626c82e5c9a7c"/>
+    <w:bookmarkStart w:id="58" w:name="Xbcd6da71180214302fa2c75f57626c82e5c9a7c"/>
     <w:p>
       <w:pPr>
         <w:pStyle w:val="Heading2"/>
@@ -3927,6 +3927,256 @@
                 <w:rFonts w:ascii="Times New Roman" w:hAnsi="Times New Roman" w:cs="Times New Roman" w:eastAsia="Times New Roman"/>
                 <w:sz w:val="22"/>
               </w:rPr>
+              <w:t xml:space="preserve">Birinchi darajali asosiy kapital monandligi, %: milliy</w:t>
+            </w:r>
+          </w:p>
+        </w:tc>
+        <w:tc>
+          <w:tcPr>
+            <w:tcW w:type="dxa" w:w="1179"/>
+          </w:tcPr>
+          <w:p>
+            <w:pPr>
+              <w:pStyle w:val="Compact"/>
+              <w:spacing w:line="240" w:lineRule="auto"/>
+              <w:ind w:firstLine="0"/>
+              <w:jc w:val="left"/>
+            </w:pPr>
+            <w:r>
+              <w:rPr>
+                <w:rFonts w:ascii="Times New Roman" w:hAnsi="Times New Roman" w:cs="Times New Roman" w:eastAsia="Times New Roman"/>
+                <w:sz w:val="22"/>
+              </w:rPr>
+              <w:t xml:space="preserve">11,86</w:t>
+            </w:r>
+          </w:p>
+        </w:tc>
+        <w:tc>
+          <w:tcPr>
+            <w:tcW w:type="dxa" w:w="1179"/>
+          </w:tcPr>
+          <w:p>
+            <w:pPr>
+              <w:pStyle w:val="Compact"/>
+              <w:spacing w:line="240" w:lineRule="auto"/>
+              <w:ind w:firstLine="0"/>
+              <w:jc w:val="left"/>
+            </w:pPr>
+            <w:r>
+              <w:rPr>
+                <w:rFonts w:ascii="Times New Roman" w:hAnsi="Times New Roman" w:cs="Times New Roman" w:eastAsia="Times New Roman"/>
+                <w:sz w:val="22"/>
+              </w:rPr>
+              <w:t xml:space="preserve">12,08</w:t>
+            </w:r>
+          </w:p>
+        </w:tc>
+        <w:tc>
+          <w:tcPr>
+            <w:tcW w:type="dxa" w:w="1179"/>
+          </w:tcPr>
+          <w:p>
+            <w:pPr>
+              <w:pStyle w:val="Compact"/>
+              <w:spacing w:line="240" w:lineRule="auto"/>
+              <w:ind w:firstLine="0"/>
+              <w:jc w:val="left"/>
+            </w:pPr>
+            <w:r>
+              <w:rPr>
+                <w:rFonts w:ascii="Times New Roman" w:hAnsi="Times New Roman" w:cs="Times New Roman" w:eastAsia="Times New Roman"/>
+                <w:sz w:val="22"/>
+              </w:rPr>
+              <w:t xml:space="preserve">11,03</w:t>
+            </w:r>
+          </w:p>
+        </w:tc>
+        <w:tc>
+          <w:tcPr>
+            <w:tcW w:type="dxa" w:w="1179"/>
+          </w:tcPr>
+          <w:p>
+            <w:pPr>
+              <w:pStyle w:val="Compact"/>
+              <w:spacing w:line="240" w:lineRule="auto"/>
+              <w:ind w:firstLine="0"/>
+              <w:jc w:val="left"/>
+            </w:pPr>
+            <w:r>
+              <w:rPr>
+                <w:rFonts w:ascii="Times New Roman" w:hAnsi="Times New Roman" w:cs="Times New Roman" w:eastAsia="Times New Roman"/>
+                <w:sz w:val="22"/>
+              </w:rPr>
+              <w:t xml:space="preserve">10,62</w:t>
+            </w:r>
+          </w:p>
+        </w:tc>
+        <w:tc>
+          <w:tcPr>
+            <w:tcW w:type="dxa" w:w="1179"/>
+          </w:tcPr>
+          <w:p>
+            <w:pPr>
+              <w:pStyle w:val="Compact"/>
+              <w:spacing w:line="240" w:lineRule="auto"/>
+              <w:ind w:firstLine="0"/>
+              <w:jc w:val="left"/>
+            </w:pPr>
+            <w:r>
+              <w:rPr>
+                <w:rFonts w:ascii="Times New Roman" w:hAnsi="Times New Roman" w:cs="Times New Roman" w:eastAsia="Times New Roman"/>
+                <w:sz w:val="22"/>
+              </w:rPr>
+              <w:t xml:space="preserve">10,21</w:t>
+            </w:r>
+          </w:p>
+        </w:tc>
+      </w:tr>
+      <w:tr>
+        <w:trPr>
+          <w:cantSplit/>
+        </w:trPr>
+        <w:tc>
+          <w:tcPr>
+            <w:tcW w:type="dxa" w:w="3402"/>
+          </w:tcPr>
+          <w:p>
+            <w:pPr>
+              <w:pStyle w:val="Compact"/>
+              <w:spacing w:line="240" w:lineRule="auto"/>
+              <w:ind w:firstLine="0"/>
+              <w:jc w:val="left"/>
+            </w:pPr>
+            <w:r>
+              <w:rPr>
+                <w:rFonts w:ascii="Times New Roman" w:hAnsi="Times New Roman" w:cs="Times New Roman" w:eastAsia="Times New Roman"/>
+                <w:sz w:val="22"/>
+              </w:rPr>
+              <w:t xml:space="preserve">MHXS asosida qayta hisoblangan</w:t>
+            </w:r>
+          </w:p>
+        </w:tc>
+        <w:tc>
+          <w:tcPr>
+            <w:tcW w:type="dxa" w:w="1179"/>
+          </w:tcPr>
+          <w:p>
+            <w:pPr>
+              <w:pStyle w:val="Compact"/>
+              <w:spacing w:line="240" w:lineRule="auto"/>
+              <w:ind w:firstLine="0"/>
+              <w:jc w:val="left"/>
+            </w:pPr>
+            <w:r>
+              <w:rPr>
+                <w:rFonts w:ascii="Times New Roman" w:hAnsi="Times New Roman" w:cs="Times New Roman" w:eastAsia="Times New Roman"/>
+                <w:sz w:val="22"/>
+              </w:rPr>
+              <w:t xml:space="preserve">11,89</w:t>
+            </w:r>
+          </w:p>
+        </w:tc>
+        <w:tc>
+          <w:tcPr>
+            <w:tcW w:type="dxa" w:w="1179"/>
+          </w:tcPr>
+          <w:p>
+            <w:pPr>
+              <w:pStyle w:val="Compact"/>
+              <w:spacing w:line="240" w:lineRule="auto"/>
+              <w:ind w:firstLine="0"/>
+              <w:jc w:val="left"/>
+            </w:pPr>
+            <w:r>
+              <w:rPr>
+                <w:rFonts w:ascii="Times New Roman" w:hAnsi="Times New Roman" w:cs="Times New Roman" w:eastAsia="Times New Roman"/>
+                <w:sz w:val="22"/>
+              </w:rPr>
+              <w:t xml:space="preserve">11,62</w:t>
+            </w:r>
+          </w:p>
+        </w:tc>
+        <w:tc>
+          <w:tcPr>
+            <w:tcW w:type="dxa" w:w="1179"/>
+          </w:tcPr>
+          <w:p>
+            <w:pPr>
+              <w:pStyle w:val="Compact"/>
+              <w:spacing w:line="240" w:lineRule="auto"/>
+              <w:ind w:firstLine="0"/>
+              <w:jc w:val="left"/>
+            </w:pPr>
+            <w:r>
+              <w:rPr>
+                <w:rFonts w:ascii="Times New Roman" w:hAnsi="Times New Roman" w:cs="Times New Roman" w:eastAsia="Times New Roman"/>
+                <w:sz w:val="22"/>
+              </w:rPr>
+              <w:t xml:space="preserve">10,72</w:t>
+            </w:r>
+          </w:p>
+        </w:tc>
+        <w:tc>
+          <w:tcPr>
+            <w:tcW w:type="dxa" w:w="1179"/>
+          </w:tcPr>
+          <w:p>
+            <w:pPr>
+              <w:pStyle w:val="Compact"/>
+              <w:spacing w:line="240" w:lineRule="auto"/>
+              <w:ind w:firstLine="0"/>
+              <w:jc w:val="left"/>
+            </w:pPr>
+            <w:r>
+              <w:rPr>
+                <w:rFonts w:ascii="Times New Roman" w:hAnsi="Times New Roman" w:cs="Times New Roman" w:eastAsia="Times New Roman"/>
+                <w:sz w:val="22"/>
+              </w:rPr>
+              <w:t xml:space="preserve">10,04</w:t>
+            </w:r>
+          </w:p>
+        </w:tc>
+        <w:tc>
+          <w:tcPr>
+            <w:tcW w:type="dxa" w:w="1179"/>
+          </w:tcPr>
+          <w:p>
+            <w:pPr>
+              <w:pStyle w:val="Compact"/>
+              <w:spacing w:line="240" w:lineRule="auto"/>
+              <w:ind w:firstLine="0"/>
+              <w:jc w:val="left"/>
+            </w:pPr>
+            <w:r>
+              <w:rPr>
+                <w:rFonts w:ascii="Times New Roman" w:hAnsi="Times New Roman" w:cs="Times New Roman" w:eastAsia="Times New Roman"/>
+                <w:sz w:val="22"/>
+              </w:rPr>
+              <w:t xml:space="preserve">8,87</w:t>
+            </w:r>
+          </w:p>
+        </w:tc>
+      </w:tr>
+      <w:tr>
+        <w:trPr>
+          <w:cantSplit/>
+        </w:trPr>
+        <w:tc>
+          <w:tcPr>
+            <w:tcW w:type="dxa" w:w="3402"/>
+          </w:tcPr>
+          <w:p>
+            <w:pPr>
+              <w:pStyle w:val="Compact"/>
+              <w:spacing w:line="240" w:lineRule="auto"/>
+              <w:ind w:firstLine="0"/>
+              <w:jc w:val="left"/>
+            </w:pPr>
+            <w:r>
+              <w:rPr>
+                <w:rFonts w:ascii="Times New Roman" w:hAnsi="Times New Roman" w:cs="Times New Roman" w:eastAsia="Times New Roman"/>
+                <w:sz w:val="22"/>
+              </w:rPr>
               <w:t xml:space="preserve">Kredit zaxiralari / kreditlar, %: milliy</w:t>
             </w:r>
           </w:p>
@@ -4422,7 +4672,7 @@
           <w:i/>
           <w:sz w:val="28"/>
         </w:rPr>
-        <w:t xml:space="preserve">Izoh: milliy kredit zaxiralari – kreditlar bo‘yicha maxsus zaxiralar va standart kreditlar bo‘yicha zaxiralar yig‘indisi; 2022-yil uchun MHXS ma’lumotlari 2023-yil hisobotidagi qayta hisoblangan qiymatlar, 2024-yil uchun 2025-yil hisobotidagi qiyosiy ma’lumotlar olindi.</w:t>
+        <w:t xml:space="preserve">Izoh: milliy kredit zaxiralari – kreditlar bo‘yicha maxsus zaxiralar va standart kreditlar bo‘yicha zaxiralar yig‘indisi; 2022-yil uchun MHXS ma’lumotlari 2023-yil hisobotidagi qayta hisoblangan qiymatlar, 2024-yil uchun 2025-yil hisobotidagi qiyosiy ma’lumotlar olindi; MHXS asosidagi kapital monandligi rasmiy hisobotdagi risk bo‘yicha tortilgan aktivlar va chegirmalar asosida qayta hisoblandi.</w:t>
       </w:r>
     </w:p>
     <w:p>
@@ -4437,7 +4687,7 @@
           <w:rFonts w:ascii="Times New Roman" w:hAnsi="Times New Roman" w:cs="Times New Roman" w:eastAsia="Times New Roman"/>
           <w:sz w:val="28"/>
         </w:rPr>
-        <w:t xml:space="preserve">Jadval ma’lumotlari shuni ko‘rsatadiki, tahlil davrining barcha yillarida MHXS bo‘yicha xususiy kapital milliy hisobotdagidan kam bo‘lgan, tafovut esa 2022–2023-yillardagi 3,2–3,3 foizdan 2025-yilda 13,5 foizgacha, ya’ni to‘rt barobar kengaygan. Sof foyda bo‘yicha tafovut bir yo‘nalishli emas: 2022-yilda MHXS bo‘yicha foyda milliy hisobotdagidan 7,6 foiz ko‘p, qolgan yillarda esa 6,1–30,2 foiz kam bo‘lgan. Besh yil davomida bank milliy hisobot bo‘yicha jami 5 912,2 mlrd so‘m, MHXS bo‘yicha esa 5 005,7 mlrd so‘m sof foyda olgan, boshqacha aytganda, milliy hisobot bank daromadliligini besh yillik yig‘indida 906,5 mlrd so‘mga yoki 18,1 foizga oshirib ko‘rsatgan (2.3.2-rasm).</w:t>
+        <w:t xml:space="preserve">Jadval ma’lumotlari shuni ko‘rsatadiki, tahlil davrining barcha yillarida MHXS bo‘yicha xususiy kapital milliy hisobotdagidan kam bo‘lgan, tafovut esa 2022–2023-yillardagi 3,2–3,3 foizdan 2025-yilda 13,5 foizgacha, ya’ni to‘rt barobar kengaygan. Kapitaldagi bu tafovut kapital monandligiga ham bevosita ta’sir qiladi: MHXS ma’lumotlari asosida qayta hisoblangan birinchi darajali asosiy kapital monandligi 2021-yildagi 11,89 foizdan 2025-yilda 8,87 foizgacha pasaygan, rasmiy hisobotda esa 2025-yilda 10,21 foizni tashkil etgan. Boshqacha aytganda, 8 foizlik minimal talabdan ortiqcha kapital zaxirasi rasmiy hisobot bo‘yicha 2,21 foiz punkt, MHXS bo‘yicha esa atigi 0,87 foiz punkt, ya’ni 2,5 barobar kichik. Sof foyda bo‘yicha tafovut bir yo‘nalishli emas: 2022-yilda MHXS bo‘yicha foyda milliy hisobotdagidan 7,6 foiz ko‘p, qolgan yillarda esa 6,1–30,2 foiz kam bo‘lgan. Besh yil davomida bank milliy hisobot bo‘yicha jami 5 912,2 mlrd so‘m, MHXS bo‘yicha esa 5 005,7 mlrd so‘m sof foyda olgan, boshqacha aytganda, milliy hisobot bank daromadliligini besh yillik yig‘indida 906,5 mlrd so‘mga yoki 18,1 foizga oshirib ko‘rsatgan (2.3.2-rasm).</w:t>
       </w:r>
     </w:p>
     <w:p>
@@ -6051,6 +6301,256 @@
                 <w:rFonts w:ascii="Times New Roman" w:hAnsi="Times New Roman" w:cs="Times New Roman" w:eastAsia="Times New Roman"/>
                 <w:sz w:val="22"/>
               </w:rPr>
+              <w:t xml:space="preserve">Birinchi darajali asosiy kapital monandligi, %: milliy</w:t>
+            </w:r>
+          </w:p>
+        </w:tc>
+        <w:tc>
+          <w:tcPr>
+            <w:tcW w:type="dxa" w:w="1179"/>
+          </w:tcPr>
+          <w:p>
+            <w:pPr>
+              <w:pStyle w:val="Compact"/>
+              <w:spacing w:line="240" w:lineRule="auto"/>
+              <w:ind w:firstLine="0"/>
+              <w:jc w:val="left"/>
+            </w:pPr>
+            <w:r>
+              <w:rPr>
+                <w:rFonts w:ascii="Times New Roman" w:hAnsi="Times New Roman" w:cs="Times New Roman" w:eastAsia="Times New Roman"/>
+                <w:sz w:val="22"/>
+              </w:rPr>
+              <w:t xml:space="preserve">13,22</w:t>
+            </w:r>
+          </w:p>
+        </w:tc>
+        <w:tc>
+          <w:tcPr>
+            <w:tcW w:type="dxa" w:w="1179"/>
+          </w:tcPr>
+          <w:p>
+            <w:pPr>
+              <w:pStyle w:val="Compact"/>
+              <w:spacing w:line="240" w:lineRule="auto"/>
+              <w:ind w:firstLine="0"/>
+              <w:jc w:val="left"/>
+            </w:pPr>
+            <w:r>
+              <w:rPr>
+                <w:rFonts w:ascii="Times New Roman" w:hAnsi="Times New Roman" w:cs="Times New Roman" w:eastAsia="Times New Roman"/>
+                <w:sz w:val="22"/>
+              </w:rPr>
+              <w:t xml:space="preserve">20,03</w:t>
+            </w:r>
+          </w:p>
+        </w:tc>
+        <w:tc>
+          <w:tcPr>
+            <w:tcW w:type="dxa" w:w="1179"/>
+          </w:tcPr>
+          <w:p>
+            <w:pPr>
+              <w:pStyle w:val="Compact"/>
+              <w:spacing w:line="240" w:lineRule="auto"/>
+              <w:ind w:firstLine="0"/>
+              <w:jc w:val="left"/>
+            </w:pPr>
+            <w:r>
+              <w:rPr>
+                <w:rFonts w:ascii="Times New Roman" w:hAnsi="Times New Roman" w:cs="Times New Roman" w:eastAsia="Times New Roman"/>
+                <w:sz w:val="22"/>
+              </w:rPr>
+              <w:t xml:space="preserve">17,60</w:t>
+            </w:r>
+          </w:p>
+        </w:tc>
+        <w:tc>
+          <w:tcPr>
+            <w:tcW w:type="dxa" w:w="1179"/>
+          </w:tcPr>
+          <w:p>
+            <w:pPr>
+              <w:pStyle w:val="Compact"/>
+              <w:spacing w:line="240" w:lineRule="auto"/>
+              <w:ind w:firstLine="0"/>
+              <w:jc w:val="left"/>
+            </w:pPr>
+            <w:r>
+              <w:rPr>
+                <w:rFonts w:ascii="Times New Roman" w:hAnsi="Times New Roman" w:cs="Times New Roman" w:eastAsia="Times New Roman"/>
+                <w:sz w:val="22"/>
+              </w:rPr>
+              <w:t xml:space="preserve">12,95</w:t>
+            </w:r>
+          </w:p>
+        </w:tc>
+        <w:tc>
+          <w:tcPr>
+            <w:tcW w:type="dxa" w:w="1179"/>
+          </w:tcPr>
+          <w:p>
+            <w:pPr>
+              <w:pStyle w:val="Compact"/>
+              <w:spacing w:line="240" w:lineRule="auto"/>
+              <w:ind w:firstLine="0"/>
+              <w:jc w:val="left"/>
+            </w:pPr>
+            <w:r>
+              <w:rPr>
+                <w:rFonts w:ascii="Times New Roman" w:hAnsi="Times New Roman" w:cs="Times New Roman" w:eastAsia="Times New Roman"/>
+                <w:sz w:val="22"/>
+              </w:rPr>
+              <w:t xml:space="preserve">16,39</w:t>
+            </w:r>
+          </w:p>
+        </w:tc>
+      </w:tr>
+      <w:tr>
+        <w:trPr>
+          <w:cantSplit/>
+        </w:trPr>
+        <w:tc>
+          <w:tcPr>
+            <w:tcW w:type="dxa" w:w="3402"/>
+          </w:tcPr>
+          <w:p>
+            <w:pPr>
+              <w:pStyle w:val="Compact"/>
+              <w:spacing w:line="240" w:lineRule="auto"/>
+              <w:ind w:firstLine="0"/>
+              <w:jc w:val="left"/>
+            </w:pPr>
+            <w:r>
+              <w:rPr>
+                <w:rFonts w:ascii="Times New Roman" w:hAnsi="Times New Roman" w:cs="Times New Roman" w:eastAsia="Times New Roman"/>
+                <w:sz w:val="22"/>
+              </w:rPr>
+              <w:t xml:space="preserve">MHXS asosida qayta hisoblangan</w:t>
+            </w:r>
+          </w:p>
+        </w:tc>
+        <w:tc>
+          <w:tcPr>
+            <w:tcW w:type="dxa" w:w="1179"/>
+          </w:tcPr>
+          <w:p>
+            <w:pPr>
+              <w:pStyle w:val="Compact"/>
+              <w:spacing w:line="240" w:lineRule="auto"/>
+              <w:ind w:firstLine="0"/>
+              <w:jc w:val="left"/>
+            </w:pPr>
+            <w:r>
+              <w:rPr>
+                <w:rFonts w:ascii="Times New Roman" w:hAnsi="Times New Roman" w:cs="Times New Roman" w:eastAsia="Times New Roman"/>
+                <w:sz w:val="22"/>
+              </w:rPr>
+              <w:t xml:space="preserve">13,59</w:t>
+            </w:r>
+          </w:p>
+        </w:tc>
+        <w:tc>
+          <w:tcPr>
+            <w:tcW w:type="dxa" w:w="1179"/>
+          </w:tcPr>
+          <w:p>
+            <w:pPr>
+              <w:pStyle w:val="Compact"/>
+              <w:spacing w:line="240" w:lineRule="auto"/>
+              <w:ind w:firstLine="0"/>
+              <w:jc w:val="left"/>
+            </w:pPr>
+            <w:r>
+              <w:rPr>
+                <w:rFonts w:ascii="Times New Roman" w:hAnsi="Times New Roman" w:cs="Times New Roman" w:eastAsia="Times New Roman"/>
+                <w:sz w:val="22"/>
+              </w:rPr>
+              <w:t xml:space="preserve">20,17</w:t>
+            </w:r>
+          </w:p>
+        </w:tc>
+        <w:tc>
+          <w:tcPr>
+            <w:tcW w:type="dxa" w:w="1179"/>
+          </w:tcPr>
+          <w:p>
+            <w:pPr>
+              <w:pStyle w:val="Compact"/>
+              <w:spacing w:line="240" w:lineRule="auto"/>
+              <w:ind w:firstLine="0"/>
+              <w:jc w:val="left"/>
+            </w:pPr>
+            <w:r>
+              <w:rPr>
+                <w:rFonts w:ascii="Times New Roman" w:hAnsi="Times New Roman" w:cs="Times New Roman" w:eastAsia="Times New Roman"/>
+                <w:sz w:val="22"/>
+              </w:rPr>
+              <w:t xml:space="preserve">16,20</w:t>
+            </w:r>
+          </w:p>
+        </w:tc>
+        <w:tc>
+          <w:tcPr>
+            <w:tcW w:type="dxa" w:w="1179"/>
+          </w:tcPr>
+          <w:p>
+            <w:pPr>
+              <w:pStyle w:val="Compact"/>
+              <w:spacing w:line="240" w:lineRule="auto"/>
+              <w:ind w:firstLine="0"/>
+              <w:jc w:val="left"/>
+            </w:pPr>
+            <w:r>
+              <w:rPr>
+                <w:rFonts w:ascii="Times New Roman" w:hAnsi="Times New Roman" w:cs="Times New Roman" w:eastAsia="Times New Roman"/>
+                <w:sz w:val="22"/>
+              </w:rPr>
+              <w:t xml:space="preserve">15,02</w:t>
+            </w:r>
+          </w:p>
+        </w:tc>
+        <w:tc>
+          <w:tcPr>
+            <w:tcW w:type="dxa" w:w="1179"/>
+          </w:tcPr>
+          <w:p>
+            <w:pPr>
+              <w:pStyle w:val="Compact"/>
+              <w:spacing w:line="240" w:lineRule="auto"/>
+              <w:ind w:firstLine="0"/>
+              <w:jc w:val="left"/>
+            </w:pPr>
+            <w:r>
+              <w:rPr>
+                <w:rFonts w:ascii="Times New Roman" w:hAnsi="Times New Roman" w:cs="Times New Roman" w:eastAsia="Times New Roman"/>
+                <w:sz w:val="22"/>
+              </w:rPr>
+              <w:t xml:space="preserve">18,24</w:t>
+            </w:r>
+          </w:p>
+        </w:tc>
+      </w:tr>
+      <w:tr>
+        <w:trPr>
+          <w:cantSplit/>
+        </w:trPr>
+        <w:tc>
+          <w:tcPr>
+            <w:tcW w:type="dxa" w:w="3402"/>
+          </w:tcPr>
+          <w:p>
+            <w:pPr>
+              <w:pStyle w:val="Compact"/>
+              <w:spacing w:line="240" w:lineRule="auto"/>
+              <w:ind w:firstLine="0"/>
+              <w:jc w:val="left"/>
+            </w:pPr>
+            <w:r>
+              <w:rPr>
+                <w:rFonts w:ascii="Times New Roman" w:hAnsi="Times New Roman" w:cs="Times New Roman" w:eastAsia="Times New Roman"/>
+                <w:sz w:val="22"/>
+              </w:rPr>
               <w:t xml:space="preserve">Yashirin kredit riski koeffitsiyenti</w:t>
             </w:r>
           </w:p>
@@ -6246,7 +6746,7 @@
           <w:rFonts w:ascii="Times New Roman" w:hAnsi="Times New Roman" w:cs="Times New Roman" w:eastAsia="Times New Roman"/>
           <w:sz w:val="28"/>
         </w:rPr>
-        <w:t xml:space="preserve">Rasm ma’lumotlari kutilgan kredit zararlari modelining asosiy afzalligini, ya’ni kredit riskini o‘z vaqtida tan olishini yaqqol ko‘rsatadi. MHXS bo‘yicha zarar 2023 va 2024-yillarga taqsimlangan, milliy hisobotda esa u bir yil kechikib va bir yo‘la tan olingan. Natijada 2023-yil yakunida milliy hisobot bo‘yicha xususiy kapital MHXS bo‘yicha kapitaldan 355,5 mlrd so‘mga ko‘p bo‘lgan, 2024-yilda esa, aksincha, 550,7 mlrd so‘mga kam bo‘lib qolgan. Boshqacha aytganda, milliy hisobot asosidagi baholash 2023-yil yakunida bankning kapitali va daromadliligi bo‘yicha xavfsiz signal bergan, holbuki MHXS hisobotida muammo allaqachon namoyon bo‘lgan edi. Bu holat 1.2-paragrafda ko‘rib chiqilgan kutilgan kredit zararlari modelining prosiklik xususiyati to‘g‘risidagi xulosani boshqa tomondan ham to‘ldiradi: ertaroq tan olingan zarar kapitalga bosimni ertaroq yuzaga keltiradi, ammo nazorat organi va bank rahbariyatiga choralar ko‘rish uchun vaqt beradi.</w:t>
+        <w:t xml:space="preserve">Rasm ma’lumotlari kutilgan kredit zararlari modelining asosiy afzalligini, ya’ni kredit riskini o‘z vaqtida tan olishini yaqqol ko‘rsatadi. MHXS bo‘yicha zarar 2023 va 2024-yillarga taqsimlangan, milliy hisobotda esa u bir yil kechikib va bir yo‘la tan olingan. Natijada 2023-yil yakunida milliy hisobot bo‘yicha xususiy kapital MHXS bo‘yicha kapitaldan 355,5 mlrd so‘mga ko‘p bo‘lgan, 2024-yilda esa, aksincha, 550,7 mlrd so‘mga kam bo‘lib qolgan. Shunga mos ravishda birinchi darajali asosiy kapital monandligi 2023-yilda rasmiy hisobot bo‘yicha 17,60 foiz, MHXS asosida esa 16,20 foiz, 2024-yilda esa mos ravishda 12,95 va 15,02 foizni tashkil etgan. Boshqacha aytganda, milliy hisobot asosidagi baholash 2023-yil yakunida bankning kapitali va daromadliligi bo‘yicha xavfsiz signal bergan, holbuki MHXS hisobotida muammo allaqachon namoyon bo‘lgan edi. Bu holat 1.2-paragrafda ko‘rib chiqilgan kutilgan kredit zararlari modelining prosiklik xususiyati to‘g‘risidagi xulosani boshqa tomondan ham to‘ldiradi: ertaroq tan olingan zarar kapitalga bosimni ertaroq yuzaga keltiradi, ammo nazorat organi va bank rahbariyatiga choralar ko‘rish uchun vaqt beradi.</w:t>
       </w:r>
     </w:p>
     <w:p>
@@ -6261,7 +6761,7 @@
           <w:rFonts w:ascii="Times New Roman" w:hAnsi="Times New Roman" w:cs="Times New Roman" w:eastAsia="Times New Roman"/>
           <w:sz w:val="28"/>
         </w:rPr>
-        <w:t xml:space="preserve">Ikki bank misolida olingan natijalarni umumlashtirish uchun «O‘zsanoatqurilishbank» ATB ning 2025-yil yakunidagi ko‘rsatkichlari moliyaviy barqarorlikning asosiy bloklari bo‘yicha guruhlandi va ularning har biri uchun milliy va xalqaro yondashuv o‘rtasidagi tafovut hisoblandi. Kapital monandligi bo‘yicha tafovutni aniqlashda MHXS va milliy hisobot o‘rtasidagi xususiy kapital farqi birinchi darajali asosiy kapitaldan chegirildi va risk bo‘yicha tortilgan aktivlar o‘zgarmagan deb qabul qilindi. Sof barqaror moliyalashtirish me’yori esa ikki metodika – Markaziy bank va Bazel III metodikasi hamda ikki hisobot turi bo‘yicha to‘rt variantda hisoblandi</w:t>
+        <w:t xml:space="preserve">Ikki bank misolida olingan natijalarni umumlashtirish uchun «O‘zsanoatqurilishbank» ATB ning 2025-yil yakunidagi ko‘rsatkichlari moliyaviy barqarorlikning asosiy bloklari bo‘yicha guruhlandi va ularning har biri uchun milliy va xalqaro yondashuv o‘rtasidagi tafovut hisoblandi. Kapital monandligi bo‘yicha alohida izoh berish lozim. Bankning MHXS hisobotida e’lon qilingan kapital monandligi koeffitsiyentlari ham milliy buxgalteriya hisobi ma’lumotlari asosida hisoblangani qayd etilgan</w:t>
       </w:r>
       <w:r>
         <w:rPr>
@@ -6271,6 +6771,13 @@
       </w:r>
       <w:r>
         <w:rPr>
+          <w:rFonts w:ascii="Times New Roman" w:hAnsi="Times New Roman" w:cs="Times New Roman" w:eastAsia="Times New Roman"/>
+          <w:sz w:val="28"/>
+        </w:rPr>
+        <w:t xml:space="preserve">, MHXS ma’lumotlariga asoslangan koeffitsiyentlar esa banklar tomonidan e’lon qilinmaydi. Shu sababli ular Markaziy bank metodikasi bo‘yicha muallif tomonidan qayta hisoblandi: birinchi darajali asosiy kapital MHXS bo‘yicha xususiy kapitaldan joriy yil sof foydasi va ozchilik ulushini ayirib, so‘ngra bankning rasmiy hisobot shaklidagi 257,4 mlrd so‘mlik chegirmalarni qo‘llash orqali aniqlandi; qo‘shimcha birinchi darajali kapital (3 615,3 mlrd so‘mlik muddatsiz obligatsiyalar) va ikkinchi darajali kapital rasmiy hisobotdagi qiymatda olinib, faqat joriy yil foydasidagi farqqa tuzatildi; risk bo‘yicha tortilgan aktivlar sifatida esa rasmiy hisobotdagi 95 179,7 mlrd so‘m qabul qilindi</w:t>
+      </w:r>
+      <w:r>
+        <w:rPr>
           <w:rStyle w:val="FootnoteReference"/>
         </w:rPr>
         <w:footnoteReference w:id="50"/>
@@ -6280,13 +6787,32 @@
           <w:rFonts w:ascii="Times New Roman" w:hAnsi="Times New Roman" w:cs="Times New Roman" w:eastAsia="Times New Roman"/>
           <w:sz w:val="28"/>
         </w:rPr>
+        <w:t xml:space="preserve">. MHXS bo‘yicha zaxiralar ko‘pligi sababli risk bo‘yicha tortilgan aktivlar amalda biroz kichikroq bo‘lishi mumkin, biroq bu koeffitsiyentlarni 0,1 foiz punktdan ko‘p o‘zgartirmaydi. Sof barqaror moliyalashtirish me’yori esa ikki metodika – Markaziy bank va Bazel III metodikasi hamda ikki hisobot turi bo‘yicha to‘rt variantda hisoblandi</w:t>
+      </w:r>
+      <w:r>
+        <w:rPr>
+          <w:rStyle w:val="FootnoteReference"/>
+        </w:rPr>
+        <w:footnoteReference w:id="51"/>
+      </w:r>
+      <w:r>
+        <w:rPr>
+          <w:rStyle w:val="FootnoteReference"/>
+        </w:rPr>
+        <w:footnoteReference w:id="52"/>
+      </w:r>
+      <w:r>
+        <w:rPr>
+          <w:rFonts w:ascii="Times New Roman" w:hAnsi="Times New Roman" w:cs="Times New Roman" w:eastAsia="Times New Roman"/>
+          <w:sz w:val="28"/>
+        </w:rPr>
         <w:t xml:space="preserve">. Likvidlikni qoplash koeffitsiyenti uchun esa milliy amaliyotda yuqori likvid aktivlarga kiritiladigan, ammo Bazel III da bunday aktiv hisoblanmaydigan boshqa banklardagi mablag‘lar alohida ajratildi</w:t>
       </w:r>
       <w:r>
         <w:rPr>
           <w:rStyle w:val="FootnoteReference"/>
         </w:rPr>
-        <w:footnoteReference w:id="51"/>
+        <w:footnoteReference w:id="53"/>
       </w:r>
       <w:r>
         <w:rPr>
@@ -6334,7 +6860,7 @@
         <w:rPr>
           <w:rStyle w:val="FootnoteReference"/>
         </w:rPr>
-        <w:footnoteReference w:id="52"/>
+        <w:footnoteReference w:id="54"/>
       </w:r>
     </w:p>
     <w:tbl>
@@ -7167,7 +7693,7 @@
                 <w:rFonts w:ascii="Times New Roman" w:hAnsi="Times New Roman" w:cs="Times New Roman" w:eastAsia="Times New Roman"/>
                 <w:sz w:val="22"/>
               </w:rPr>
-              <w:t xml:space="preserve">10,2</w:t>
+              <w:t xml:space="preserve">10,21</w:t>
             </w:r>
           </w:p>
         </w:tc>
@@ -7187,7 +7713,7 @@
                 <w:rFonts w:ascii="Times New Roman" w:hAnsi="Times New Roman" w:cs="Times New Roman" w:eastAsia="Times New Roman"/>
                 <w:sz w:val="22"/>
               </w:rPr>
-              <w:t xml:space="preserve">≈ 8,5</w:t>
+              <w:t xml:space="preserve">8,87</w:t>
             </w:r>
           </w:p>
         </w:tc>
@@ -7207,7 +7733,7 @@
                 <w:rFonts w:ascii="Times New Roman" w:hAnsi="Times New Roman" w:cs="Times New Roman" w:eastAsia="Times New Roman"/>
                 <w:sz w:val="22"/>
               </w:rPr>
-              <w:t xml:space="preserve">−1,7 p.p.</w:t>
+              <w:t xml:space="preserve">−1,34 p.p.</w:t>
             </w:r>
           </w:p>
         </w:tc>
@@ -7252,6 +7778,111 @@
                 <w:rFonts w:ascii="Times New Roman" w:hAnsi="Times New Roman" w:cs="Times New Roman" w:eastAsia="Times New Roman"/>
                 <w:sz w:val="22"/>
               </w:rPr>
+              <w:t xml:space="preserve">Birinchi darajali kapital monandligi, %</w:t>
+            </w:r>
+          </w:p>
+        </w:tc>
+        <w:tc>
+          <w:tcPr>
+            <w:tcW w:type="dxa" w:w="1587"/>
+          </w:tcPr>
+          <w:p>
+            <w:pPr>
+              <w:pStyle w:val="Compact"/>
+              <w:spacing w:line="240" w:lineRule="auto"/>
+              <w:ind w:firstLine="0"/>
+              <w:jc w:val="left"/>
+            </w:pPr>
+            <w:r>
+              <w:rPr>
+                <w:rFonts w:ascii="Times New Roman" w:hAnsi="Times New Roman" w:cs="Times New Roman" w:eastAsia="Times New Roman"/>
+                <w:sz w:val="22"/>
+              </w:rPr>
+              <w:t xml:space="preserve">14,01</w:t>
+            </w:r>
+          </w:p>
+        </w:tc>
+        <w:tc>
+          <w:tcPr>
+            <w:tcW w:type="dxa" w:w="1587"/>
+          </w:tcPr>
+          <w:p>
+            <w:pPr>
+              <w:pStyle w:val="Compact"/>
+              <w:spacing w:line="240" w:lineRule="auto"/>
+              <w:ind w:firstLine="0"/>
+              <w:jc w:val="left"/>
+            </w:pPr>
+            <w:r>
+              <w:rPr>
+                <w:rFonts w:ascii="Times New Roman" w:hAnsi="Times New Roman" w:cs="Times New Roman" w:eastAsia="Times New Roman"/>
+                <w:sz w:val="22"/>
+              </w:rPr>
+              <w:t xml:space="preserve">12,66</w:t>
+            </w:r>
+          </w:p>
+        </w:tc>
+        <w:tc>
+          <w:tcPr>
+            <w:tcW w:type="dxa" w:w="1814"/>
+          </w:tcPr>
+          <w:p>
+            <w:pPr>
+              <w:pStyle w:val="Compact"/>
+              <w:spacing w:line="240" w:lineRule="auto"/>
+              <w:ind w:firstLine="0"/>
+              <w:jc w:val="left"/>
+            </w:pPr>
+            <w:r>
+              <w:rPr>
+                <w:rFonts w:ascii="Times New Roman" w:hAnsi="Times New Roman" w:cs="Times New Roman" w:eastAsia="Times New Roman"/>
+                <w:sz w:val="22"/>
+              </w:rPr>
+              <w:t xml:space="preserve">−1,35 p.p.</w:t>
+            </w:r>
+          </w:p>
+        </w:tc>
+      </w:tr>
+      <w:tr>
+        <w:trPr>
+          <w:cantSplit/>
+        </w:trPr>
+        <w:tc>
+          <w:tcPr>
+            <w:tcW w:type="dxa" w:w="1474"/>
+          </w:tcPr>
+          <w:p>
+            <w:pPr>
+              <w:pStyle w:val="Compact"/>
+              <w:spacing w:line="240" w:lineRule="auto"/>
+              <w:ind w:firstLine="0"/>
+              <w:jc w:val="left"/>
+            </w:pPr>
+            <w:r>
+              <w:rPr>
+                <w:rFonts w:ascii="Times New Roman" w:hAnsi="Times New Roman" w:cs="Times New Roman" w:eastAsia="Times New Roman"/>
+                <w:sz w:val="22"/>
+              </w:rPr>
+              <w:t xml:space="preserve">Kapital</w:t>
+            </w:r>
+          </w:p>
+        </w:tc>
+        <w:tc>
+          <w:tcPr>
+            <w:tcW w:type="dxa" w:w="2835"/>
+          </w:tcPr>
+          <w:p>
+            <w:pPr>
+              <w:pStyle w:val="Compact"/>
+              <w:spacing w:line="240" w:lineRule="auto"/>
+              <w:ind w:firstLine="0"/>
+              <w:jc w:val="left"/>
+            </w:pPr>
+            <w:r>
+              <w:rPr>
+                <w:rFonts w:ascii="Times New Roman" w:hAnsi="Times New Roman" w:cs="Times New Roman" w:eastAsia="Times New Roman"/>
+                <w:sz w:val="22"/>
+              </w:rPr>
               <w:t xml:space="preserve">Regulyativ kapital monandligi, %</w:t>
             </w:r>
           </w:p>
@@ -7272,7 +7903,7 @@
                 <w:rFonts w:ascii="Times New Roman" w:hAnsi="Times New Roman" w:cs="Times New Roman" w:eastAsia="Times New Roman"/>
                 <w:sz w:val="22"/>
               </w:rPr>
-              <w:t xml:space="preserve">17,0</w:t>
+              <w:t xml:space="preserve">17,02</w:t>
             </w:r>
           </w:p>
         </w:tc>
@@ -7292,7 +7923,7 @@
                 <w:rFonts w:ascii="Times New Roman" w:hAnsi="Times New Roman" w:cs="Times New Roman" w:eastAsia="Times New Roman"/>
                 <w:sz w:val="22"/>
               </w:rPr>
-              <w:t xml:space="preserve">≈ 15,3</w:t>
+              <w:t xml:space="preserve">15,32</w:t>
             </w:r>
           </w:p>
         </w:tc>
@@ -7312,7 +7943,7 @@
                 <w:rFonts w:ascii="Times New Roman" w:hAnsi="Times New Roman" w:cs="Times New Roman" w:eastAsia="Times New Roman"/>
                 <w:sz w:val="22"/>
               </w:rPr>
-              <w:t xml:space="preserve">−1,7 p.p.</w:t>
+              <w:t xml:space="preserve">−1,70 p.p.</w:t>
             </w:r>
           </w:p>
         </w:tc>
@@ -7540,7 +8171,7 @@
           <w:rFonts w:ascii="Times New Roman" w:hAnsi="Times New Roman" w:cs="Times New Roman" w:eastAsia="Times New Roman"/>
           <w:sz w:val="28"/>
         </w:rPr>
-        <w:t xml:space="preserve">Jadval ma’lumotlari ikki yondashuv o‘rtasidagi tafovut moliyaviy barqarorlik bloklari bo‘yicha bir tekis taqsimlanmaganini ko‘rsatadi. Eng katta tafovut aktivlar sifati blokida bo‘lib, muammoli kreditlar ulushi xalqaro yondashuv bo‘yicha qariyb uch barobar, kredit riski oshgan kreditlar ulushi esa ikki barobar yuqori. Daromadlilik va kapital bloklarida tafovut 13–18 foiz atrofida bo‘lib, birinchi darajali asosiy kapital monandligi 8 foizlik minimal talabga yaqinlashadi. Likvidlik blokida esa umumiy tafovut kichik, chunki metodika va hisobot standarti ta’siri qarama-qarshi yo‘nalishda bo‘lib, bir-birini qisman qoplaydi: Bazel III koeffitsiyentlari me’yorni 5,4 foiz punktga oshiradi, MHXS tuzatishlari esa 2,8 foiz punktga pasaytiradi. Ammo likvidlikni qoplash koeffitsiyenti tarkibida xalqaro standart bo‘yicha yuqori likvid aktiv hisoblanmaydigan mablag‘lar ulushi 30,9 foizni tashkil etadi, demak, bu blokda ham yashirin risk mavjud. Tafovutning nisbiy ko‘lamini taqqoslash uchun asosiy ko‘rsatkichlar bo‘yicha nisbiy tafovut koeffitsiyenti hisoblandi (2.3.7-rasm).</w:t>
+        <w:t xml:space="preserve">Jadval ma’lumotlari ikki yondashuv o‘rtasidagi tafovut moliyaviy barqarorlik bloklari bo‘yicha bir tekis taqsimlanmaganini ko‘rsatadi. Eng katta tafovut aktivlar sifati blokida bo‘lib, muammoli kreditlar ulushi xalqaro yondashuv bo‘yicha qariyb uch barobar, kredit riski oshgan kreditlar ulushi esa ikki barobar yuqori. Daromadlilik va kapital bloklarida tafovut 13–18 foiz atrofida bo‘lib, MHXS ma’lumotlari asosida qayta hisoblangan birinchi darajali asosiy kapital monandligi 8,87 foizgacha pasayib, 8 foizlik minimal talabga yaqinlashadi. Likvidlik blokida esa umumiy tafovut kichik, chunki metodika va hisobot standarti ta’siri qarama-qarshi yo‘nalishda bo‘lib, bir-birini qisman qoplaydi: Bazel III koeffitsiyentlari me’yorni 5,4 foiz punktga oshiradi, MHXS tuzatishlari esa 2,8 foiz punktga pasaytiradi. Ammo likvidlikni qoplash koeffitsiyenti tarkibida xalqaro standart bo‘yicha yuqori likvid aktiv hisoblanmaydigan mablag‘lar ulushi 30,9 foizni tashkil etadi, demak, bu blokda ham yashirin risk mavjud. Tafovutning nisbiy ko‘lamini taqqoslash uchun asosiy ko‘rsatkichlar bo‘yicha nisbiy tafovut koeffitsiyenti hisoblandi (2.3.7-rasm).</w:t>
       </w:r>
     </w:p>
     <w:p>
@@ -7589,7 +8220,7 @@
         <w:rPr>
           <w:rStyle w:val="FootnoteReference"/>
         </w:rPr>
-        <w:footnoteReference w:id="53"/>
+        <w:footnoteReference w:id="55"/>
       </w:r>
     </w:p>
     <w:p>
@@ -7604,7 +8235,7 @@
           <w:rFonts w:ascii="Times New Roman" w:hAnsi="Times New Roman" w:cs="Times New Roman" w:eastAsia="Times New Roman"/>
           <w:sz w:val="28"/>
         </w:rPr>
-        <w:t xml:space="preserve">Rasmdan ko‘rinib turibdiki, nisbiy tafovut koeffitsiyenti muammoli kreditlar ulushi bo‘yicha +195,7 foizni, kredit zaxiralari bo‘yicha +44,2 foizni tashkil etgan bo‘lsa, sof foyda, birinchi darajali asosiy kapital monandligi va xususiy kapital bo‘yicha −13,5 dan −17,9 foizgacha, jami aktivlar bo‘yicha −5,1 foizni, sof barqaror moliyalashtirish me’yori bo‘yicha esa bor-yo‘g‘i +2,1 foizni tashkil etgan. Shunday qilib, tafovut 2.3.1-rasmda ko‘rsatilgan zanjir bo‘ylab kamayib boradi va bu nazariy xulosani real bank ma’lumotlari to‘liq tasdiqlaydi. Muallif fikricha, bu natija integral baholash metodikasini ishlab chiqish uchun ikki muhim talabni belgilaydi. Birinchidan, metodikada aktivlar sifati bloki xalqaro standartlar, ya’ni MHXS 9 ning bosqichlar tasnifi asosida baholanishi, milliy ko‘rsatkichlar qo‘llanganda esa ular yashirin kredit riski koeffitsiyenti yordamida tuzatilishi lozim. Ikkinchidan, kapital blokida milliy hisobot bo‘yicha regulyativ kapital bilan bir qatorda MHXS bo‘yicha xususiy kapitalga asoslangan tuzatilgan kapital monandligi ham hisobga olinishi kerak.</w:t>
+        <w:t xml:space="preserve">Rasmdan ko‘rinib turibdiki, nisbiy tafovut koeffitsiyenti muammoli kreditlar ulushi bo‘yicha +195,7 foizni, kredit zaxiralari bo‘yicha +44,2 foizni tashkil etgan bo‘lsa, birinchi darajali asosiy kapital monandligi, xususiy kapital va sof foyda bo‘yicha −13,1 dan −17,9 foizgacha, jami aktivlar bo‘yicha −5,1 foizni, sof barqaror moliyalashtirish me’yori bo‘yicha esa bor-yo‘g‘i +2,1 foizni tashkil etgan. Shunday qilib, tafovut 2.3.1-rasmda ko‘rsatilgan zanjir bo‘ylab kamayib boradi va bu nazariy xulosani real bank ma’lumotlari to‘liq tasdiqlaydi. Muallif fikricha, bu natija integral baholash metodikasini ishlab chiqish uchun ikki muhim talabni belgilaydi. Birinchidan, metodikada aktivlar sifati bloki xalqaro standartlar, ya’ni MHXS 9 ning bosqichlar tasnifi asosida baholanishi, milliy ko‘rsatkichlar qo‘llanganda esa ular yashirin kredit riski koeffitsiyenti yordamida tuzatilishi lozim. Ikkinchidan, kapital blokida milliy hisobot bo‘yicha regulyativ kapital bilan bir qatorda MHXS bo‘yicha xususiy kapitalga asoslangan tuzatilgan kapital monandligi ham hisobga olinishi kerak.</w:t>
       </w:r>
     </w:p>
     <w:p>
@@ -7625,7 +8256,7 @@
         <w:rPr>
           <w:rStyle w:val="FootnoteReference"/>
         </w:rPr>
-        <w:footnoteReference w:id="54"/>
+        <w:footnoteReference w:id="56"/>
       </w:r>
       <w:r>
         <w:rPr>
@@ -7638,7 +8269,7 @@
         <w:rPr>
           <w:rStyle w:val="FootnoteReference"/>
         </w:rPr>
-        <w:footnoteReference w:id="55"/>
+        <w:footnoteReference w:id="57"/>
       </w:r>
       <w:r>
         <w:rPr>
@@ -7663,7 +8294,7 @@
         <w:t xml:space="preserve">Tijorat banklari moliyaviy ko‘rsatkichlarining milliy va MHXS hisobotlari bo‘yicha qiyosiy tahlili asosida xulosa qilish mumkinki, O‘zbekiston banklarida ikki hisobot o‘rtasidagi tafovut muntazam xususiyatga ega bo‘lib, uning asosiy manbai kreditlarni tasniflash va zaxira shakllantirish qoidalaridagi farqdir. «O‘zsanoatqurilishbank» ATB da MHXS bo‘yicha kapital milliy hisobotdagidan 3,2–13,5 foiz kam, besh yillik jami sof foyda 15,3 foiz kam bo‘lib, qadrsizlangan kreditlarning 57,2 foizi milliy tasnifda muammoli hisoblanmaydi. «Mikrokreditbank» ATB misolida esa milliy hisobot zararni bir yil kechikib tan olgani aniqlandi. Yashirin kredit riski koeffitsiyenti ikkala bankda ham 1,65–3,30 oralig‘ida bo‘lib, milliy muammoli kreditlar ko‘rsatkichi kredit riskini muntazam kamsitib ko‘rsatishini tasdiqlaydi. Tafovut aktivlar sifati blokida eng katta, kapital va daromadlilik bloklarida sezilarli, likvidlik blokida esa nisbatan kichik. Bu o‘z navbatida, dissertatsiyaning keyingi bobida taklif etiladigan integral baholash metodikasida aktivlar sifatini MHXS 9 asosida baholash, milliy ko‘rsatkichlarni esa taklif etilgan tuzatish koeffitsiyentlari yordamida xalqaro standartlarga moslashtirish zaruratini asoslaydi.</w:t>
       </w:r>
     </w:p>
-    <w:bookmarkEnd w:id="56"/>
+    <w:bookmarkEnd w:id="58"/>
     <w:sectPr>
       <w:pgMar w:left="1701" w:right="850" w:top="1134" w:bottom="1134"/>
     </w:sectPr>
@@ -7991,7 +8622,7 @@
         <w:t xml:space="preserve"> </w:t>
       </w:r>
       <w:r>
-        <w:t xml:space="preserve">Tadqiqot natijasida muallif tomonidan quyidagi manbalar ma’lumotlari asosida hisoblandi: «O‘zsanoatqurilishbank» ATB ning Markaziy bankka taqdim etilgan prudensial hisobot shakllari (crs003C, crs003L, crs003O): bank balansi, daromadlar, regulyativ kapital hisob-kitobi, aktivlarni tasniflash va prudensial me’yorlar jadvallari, 2020–2025-yillar 30-dekabr holatiga; Акционерный коммерческий банк «Узбекский промышленно-строительный банк» и его дочерние организации. Консолидированная финансовая отчетность за год, закончившийся 31 декабря 2021 года, и аудиторское заключение. – Ташкент, 2022. – С. 8–9; Акционерный коммерческий банк «Узбекский промышленно-строительный банк» и его дочерние организации. Консолидированная финансовая отчетность и аудиторское заключение за годы, закончившиеся 31 декабря 2023, 2022 и 2021 гг. – Ташкент, 2024. – С. 2–3, 39–40; Joint Stock Commercial Bank «Uzbek Industrial and Construction Bank» and its subsidiaries. Consolidated Financial Statements for the year ended 31 December 2025 and Independent Auditor’s Report. – Tashkent, 2026. – P. 2–3, 28–31, 37–38.</w:t>
+        <w:t xml:space="preserve">Tadqiqot natijasida muallif tomonidan quyidagi manbalar ma’lumotlari asosida hisoblandi: «O‘zsanoatqurilishbank» ATB ning Markaziy bankka taqdim etilgan prudensial hisobot shakllari (crs003C, crs003L, crs003O): bank balansi, daromadlar, regulyativ kapital hisob-kitobi, aktivlarni tasniflash va prudensial me’yorlar jadvallari, 2020–2025-yillar 30-dekabr holatiga; Акционерный коммерческий банк «Узбекский промышленно-строительный банк» и его дочерние организации. Консолидированная финансовая отчетность за год, закончившийся 31 декабря 2021 года, и аудиторское заключение. – Ташкент, 2022. – С. 8–9; Акционерный коммерческий банк «Узбекский промышленно-строительный банк» и его дочерние организации. Консолидированная финансовая отчетность и аудиторское заключение за годы, закончившиеся 31 декабря 2023, 2022 и 2021 гг. – Ташкент, 2024. – С. 2–3, 39–40; Joint Stock Commercial Bank «Uzbek Industrial and Construction Bank» and its subsidiaries. Consolidated Financial Statements for the year ended 31 December 2025 and Independent Auditor’s Report. – Tashkent, 2026. – P. 2–3, 28–31, 37–38, 74.</w:t>
       </w:r>
     </w:p>
   </w:footnote>
@@ -8086,7 +8717,7 @@
         <w:t xml:space="preserve"> </w:t>
       </w:r>
       <w:r>
-        <w:t xml:space="preserve">Tadqiqot natijasida muallif tomonidan quyidagi manbalar ma’lumotlari asosida ishlab chiqildi: «O‘zsanoatqurilishbank» ATB ning Markaziy bankka taqdim etilgan prudensial hisobot shakllari (crs003C, crs003L, crs003O): bank balansi, daromadlar, regulyativ kapital hisob-kitobi, aktivlarni tasniflash va prudensial me’yorlar jadvallari, 2020–2025-yillar 30-dekabr holatiga; Акционерный коммерческий банк «Узбекский промышленно-строительный банк» и его дочерние организации. Консолидированная финансовая отчетность за год, закончившийся 31 декабря 2021 года, и аудиторское заключение. – Ташкент, 2022. – С. 8–9; Акционерный коммерческий банк «Узбекский промышленно-строительный банк» и его дочерние организации. Консолидированная финансовая отчетность и аудиторское заключение за годы, закончившиеся 31 декабря 2023, 2022 и 2021 гг. – Ташкент, 2024. – С. 2–3, 39–40; Joint Stock Commercial Bank «Uzbek Industrial and Construction Bank» and its subsidiaries. Consolidated Financial Statements for the year ended 31 December 2025 and Independent Auditor’s Report. – Tashkent, 2026. – P. 2–3, 28–31, 37–38.</w:t>
+        <w:t xml:space="preserve">Tadqiqot natijasida muallif tomonidan quyidagi manbalar ma’lumotlari asosida ishlab chiqildi: «O‘zsanoatqurilishbank» ATB ning Markaziy bankka taqdim etilgan prudensial hisobot shakllari (crs003C, crs003L, crs003O): bank balansi, daromadlar, regulyativ kapital hisob-kitobi, aktivlarni tasniflash va prudensial me’yorlar jadvallari, 2020–2025-yillar 30-dekabr holatiga; Акционерный коммерческий банк «Узбекский промышленно-строительный банк» и его дочерние организации. Консолидированная финансовая отчетность за год, закончившийся 31 декабря 2021 года, и аудиторское заключение. – Ташкент, 2022. – С. 8–9; Акционерный коммерческий банк «Узбекский промышленно-строительный банк» и его дочерние организации. Консолидированная финансовая отчетность и аудиторское заключение за годы, закончившиеся 31 декабря 2023, 2022 и 2021 гг. – Ташкент, 2024. – С. 2–3, 39–40; Joint Stock Commercial Bank «Uzbek Industrial and Construction Bank» and its subsidiaries. Consolidated Financial Statements for the year ended 31 December 2025 and Independent Auditor’s Report. – Tashkent, 2026. – P. 2–3, 28–31, 37–38, 74.</w:t>
       </w:r>
     </w:p>
   </w:footnote>
@@ -8162,7 +8793,7 @@
         <w:t xml:space="preserve"> </w:t>
       </w:r>
       <w:r>
-        <w:t xml:space="preserve">Tadqiqot natijasida muallif tomonidan quyidagi manbalar ma’lumotlari asosida hisoblandi: «O‘zsanoatqurilishbank» ATB ning Markaziy bankka taqdim etilgan prudensial hisobot shakllari (crs003C, crs003L, crs003O): bank balansi, daromadlar, regulyativ kapital hisob-kitobi, aktivlarni tasniflash va prudensial me’yorlar jadvallari, 2020–2025-yillar 30-dekabr holatiga; Акционерный коммерческий банк «Узбекский промышленно-строительный банк» и его дочерние организации. Консолидированная финансовая отчетность за год, закончившийся 31 декабря 2021 года, и аудиторское заключение. – Ташкент, 2022. – С. 8–9; Акционерный коммерческий банк «Узбекский промышленно-строительный банк» и его дочерние организации. Консолидированная финансовая отчетность и аудиторское заключение за годы, закончившиеся 31 декабря 2023, 2022 и 2021 гг. – Ташкент, 2024. – С. 2–3, 39–40; Joint Stock Commercial Bank «Uzbek Industrial and Construction Bank» and its subsidiaries. Consolidated Financial Statements for the year ended 31 December 2025 and Independent Auditor’s Report. – Tashkent, 2026. – P. 2–3, 28–31, 37–38; «Mikrokreditbank» ATB ning Markaziy bankka taqdim etilgan prudensial hisobot shakllari (crs005C, crs005L, crs005O): bank balansi, daromadlar, regulyativ kapital hisob-kitobi, aktivlarni tasniflash va prudensial me’yorlar jadvallari, 2020–2025-yillar 30-dekabr holatiga; Акционерно-коммерческий банк «Микрокредитбанк». Финансовая отчетность за год, закончившийся 31 декабря 2021 года, и заключение независимых аудиторов. – Ташкент, 2022. – С. 6–7; Акционерно-коммерческий банк «Микрокредитбанк». Финансовая отчетность за год, закончившийся 31 декабря 2023 года, и заключение независимых аудиторов. – Ташкент, 2024. – С. 7–8; Акционерно-коммерческий банк «Микрокредитбанк». Консолидированная финансовая отчетность за год, закончившийся 31 декабря 2025 года, и заключение независимых аудиторов. – Ташкент, 2026. – С. 11–12; Акционерно-коммерческий банк «Микрокредитбанк». Финансовая отчетность за год, закончившийся 31 декабря 2021 года, и заключение независимых аудиторов. – Ташкент, 2022. – С. 42–43; Акционерно-коммерческий банк «Микрокредитбанк». Консолидированная финансовая отчетность за год, закончившийся 31 декабря 2024 года, и заключение независимых аудиторов. – Ташкент, 2025. – С. 49–51; Акционерно-коммерческий банк «Микрокредитбанк». Финансовая отчетность за год, закончившийся 31 декабря 2022 года, и заключение независимых аудиторов. – Ташкент, 2023. – С. 42–43; Акционерно-коммерческий банк «Микрокредитбанк». Консолидированная финансовая отчетность за год, закончившийся 31 декабря 2025 года, и заключение независимых аудиторов. – Ташкент, 2026. – С. 48. – https://mkbank.uz/uz/shareholders/financial-indicators/audit-report/.</w:t>
+        <w:t xml:space="preserve">Tadqiqot natijasida muallif tomonidan quyidagi manbalar ma’lumotlari asosida hisoblandi: «O‘zsanoatqurilishbank» ATB ning Markaziy bankka taqdim etilgan prudensial hisobot shakllari (crs003C, crs003L, crs003O): bank balansi, daromadlar, regulyativ kapital hisob-kitobi, aktivlarni tasniflash va prudensial me’yorlar jadvallari, 2020–2025-yillar 30-dekabr holatiga; Акционерный коммерческий банк «Узбекский промышленно-строительный банк» и его дочерние организации. Консолидированная финансовая отчетность за год, закончившийся 31 декабря 2021 года, и аудиторское заключение. – Ташкент, 2022. – С. 8–9; Акционерный коммерческий банк «Узбекский промышленно-строительный банк» и его дочерние организации. Консолидированная финансовая отчетность и аудиторское заключение за годы, закончившиеся 31 декабря 2023, 2022 и 2021 гг. – Ташкент, 2024. – С. 2–3, 39–40; Joint Stock Commercial Bank «Uzbek Industrial and Construction Bank» and its subsidiaries. Consolidated Financial Statements for the year ended 31 December 2025 and Independent Auditor’s Report. – Tashkent, 2026. – P. 2–3, 28–31, 37–38, 74; «Mikrokreditbank» ATB ning Markaziy bankka taqdim etilgan prudensial hisobot shakllari (crs005C, crs005L, crs005O): bank balansi, daromadlar, regulyativ kapital hisob-kitobi, aktivlarni tasniflash va prudensial me’yorlar jadvallari, 2020–2025-yillar 30-dekabr holatiga; Акционерно-коммерческий банк «Микрокредитбанк». Финансовая отчетность за год, закончившийся 31 декабря 2021 года, и заключение независимых аудиторов. – Ташкент, 2022. – С. 6–7; Акционерно-коммерческий банк «Микрокредитбанк». Финансовая отчетность за год, закончившийся 31 декабря 2023 года, и заключение независимых аудиторов. – Ташкент, 2024. – С. 7–8; Акционерно-коммерческий банк «Микрокредитбанк». Консолидированная финансовая отчетность за год, закончившийся 31 декабря 2025 года, и заключение независимых аудиторов. – Ташкент, 2026. – С. 11–12; Акционерно-коммерческий банк «Микрокредитбанк». Финансовая отчетность за год, закончившийся 31 декабря 2021 года, и заключение независимых аудиторов. – Ташкент, 2022. – С. 42–43; Акционерно-коммерческий банк «Микрокредитбанк». Консолидированная финансовая отчетность за год, закончившийся 31 декабря 2024 года, и заключение независимых аудиторов. – Ташкент, 2025. – С. 49–51; Акционерно-коммерческий банк «Микрокредитбанк». Финансовая отчетность за год, закончившийся 31 декабря 2022 года, и заключение независимых аудиторов. – Ташкент, 2023. – С. 42–43; Акционерно-коммерческий банк «Микрокредитбанк». Консолидированная финансовая отчетность за год, закончившийся 31 декабря 2025 года, и заключение независимых аудиторов. – Ташкент, 2026. – С. 48. – https://mkbank.uz/uz/shareholders/financial-indicators/audit-report/.</w:t>
       </w:r>
     </w:p>
   </w:footnote>
@@ -8257,7 +8888,7 @@
         <w:t xml:space="preserve"> </w:t>
       </w:r>
       <w:r>
-        <w:t xml:space="preserve">Basel Committee on Banking Supervision. Basel III: The Net Stable Funding Ratio. – Basel: BIS, October 2014.</w:t>
+        <w:t xml:space="preserve">Joint Stock Commercial Bank «Uzbek Industrial and Construction Bank» and its subsidiaries. Consolidated Financial Statements for the year ended 31 December 2025 and Independent Auditor’s Report. – Tashkent, 2026. – P. 74.</w:t>
       </w:r>
     </w:p>
   </w:footnote>
@@ -8276,7 +8907,7 @@
         <w:t xml:space="preserve"> </w:t>
       </w:r>
       <w:r>
-        <w:t xml:space="preserve">O‘zbekiston Respublikasi Markaziy banki Boshqaruvining 2015-yil 22-iyuldagi 19/14-son qarori bilan tasdiqlangan «Tijorat banklarining likvidliligini boshqarishga qo‘yiladigan talablar to‘g‘risida»gi nizom (ro‘yxat raqami 2709) // O‘zbekiston Respublikasi qonun hujjatlari to‘plami. – 2015. – 32 (688)-son. – 437-modda.</w:t>
+        <w:t xml:space="preserve">«O‘zsanoatqurilishbank» ATB ning Markaziy bankka taqdim etilgan prudensial hisobot shakllari (crs003C, crs003L, crs003O): bank balansi, daromadlar, regulyativ kapital hisob-kitobi, aktivlarni tasniflash va prudensial me’yorlar jadvallari, 2020–2025-yillar 30-dekabr holatiga.</w:t>
       </w:r>
     </w:p>
   </w:footnote>
@@ -8295,7 +8926,7 @@
         <w:t xml:space="preserve"> </w:t>
       </w:r>
       <w:r>
-        <w:t xml:space="preserve">Basel Committee on Banking Supervision. Basel III: The Liquidity Coverage Ratio and liquidity risk monitoring tools. – Basel: BIS, January 2013.</w:t>
+        <w:t xml:space="preserve">Basel Committee on Banking Supervision. Basel III: The Net Stable Funding Ratio. – Basel: BIS, October 2014.</w:t>
       </w:r>
     </w:p>
   </w:footnote>
@@ -8314,7 +8945,7 @@
         <w:t xml:space="preserve"> </w:t>
       </w:r>
       <w:r>
-        <w:t xml:space="preserve">Tadqiqot natijasida muallif tomonidan quyidagi manbalar ma’lumotlari asosida hisoblandi: «O‘zsanoatqurilishbank» ATB ning Markaziy bankka taqdim etilgan prudensial hisobot shakllari (crs003C, crs003L, crs003O): bank balansi, daromadlar, regulyativ kapital hisob-kitobi, aktivlarni tasniflash va prudensial me’yorlar jadvallari, 2020–2025-yillar 30-dekabr holatiga; Joint Stock Commercial Bank «Uzbek Industrial and Construction Bank» and its subsidiaries. Consolidated Financial Statements for the year ended 31 December 2025 and Independent Auditor’s Report. – Tashkent, 2026. – P. 2–3, 28–31, 74; O‘zbekiston Respublikasi Markaziy banki Boshqaruvining 2015-yil 22-iyuldagi 19/14-son qarori bilan tasdiqlangan «Tijorat banklarining likvidliligini boshqarishga qo‘yiladigan talablar to‘g‘risida»gi nizom (ro‘yxat raqami 2709) // O‘zbekiston Respublikasi qonun hujjatlari to‘plami. – 2015. – 32 (688)-son. – 437-modda; Basel Committee on Banking Supervision. Basel III: The Net Stable Funding Ratio. – Basel: BIS, October 2014; Basel Committee on Banking Supervision. Basel III: The Liquidity Coverage Ratio and liquidity risk monitoring tools. – Basel: BIS, January 2013.</w:t>
+        <w:t xml:space="preserve">O‘zbekiston Respublikasi Markaziy banki Boshqaruvining 2015-yil 22-iyuldagi 19/14-son qarori bilan tasdiqlangan «Tijorat banklarining likvidliligini boshqarishga qo‘yiladigan talablar to‘g‘risida»gi nizom (ro‘yxat raqami 2709) // O‘zbekiston Respublikasi qonun hujjatlari to‘plami. – 2015. – 32 (688)-son. – 437-modda.</w:t>
       </w:r>
     </w:p>
   </w:footnote>
@@ -8333,7 +8964,7 @@
         <w:t xml:space="preserve"> </w:t>
       </w:r>
       <w:r>
-        <w:t xml:space="preserve">Tadqiqot natijasida muallif tomonidan 2.3.4-jadval ma’lumotlari asosida ishlab chiqildi.</w:t>
+        <w:t xml:space="preserve">Basel Committee on Banking Supervision. Basel III: The Liquidity Coverage Ratio and liquidity risk monitoring tools. – Basel: BIS, January 2013.</w:t>
       </w:r>
     </w:p>
   </w:footnote>
@@ -8352,11 +8983,49 @@
         <w:t xml:space="preserve"> </w:t>
       </w:r>
       <w:r>
-        <w:t xml:space="preserve">International Monetary Fund. Republic of Uzbekistan: Financial Sector Assessment Program – Financial System Stability Assessment. IMF Country Report No. 25/145. – Washington, DC: IMF, 2025.</w:t>
+        <w:t xml:space="preserve">Tadqiqot natijasida muallif tomonidan quyidagi manbalar ma’lumotlari asosida hisoblandi: «O‘zsanoatqurilishbank» ATB ning Markaziy bankka taqdim etilgan prudensial hisobot shakllari (crs003C, crs003L, crs003O): bank balansi, daromadlar, regulyativ kapital hisob-kitobi, aktivlarni tasniflash va prudensial me’yorlar jadvallari, 2020–2025-yillar 30-dekabr holatiga; Joint Stock Commercial Bank «Uzbek Industrial and Construction Bank» and its subsidiaries. Consolidated Financial Statements for the year ended 31 December 2025 and Independent Auditor’s Report. – Tashkent, 2026. – P. 2–3, 28–31, 74; O‘zbekiston Respublikasi Markaziy banki Boshqaruvining 2015-yil 22-iyuldagi 19/14-son qarori bilan tasdiqlangan «Tijorat banklarining likvidliligini boshqarishga qo‘yiladigan talablar to‘g‘risida»gi nizom (ro‘yxat raqami 2709) // O‘zbekiston Respublikasi qonun hujjatlari to‘plami. – 2015. – 32 (688)-son. – 437-modda; Basel Committee on Banking Supervision. Basel III: The Net Stable Funding Ratio. – Basel: BIS, October 2014; Basel Committee on Banking Supervision. Basel III: The Liquidity Coverage Ratio and liquidity risk monitoring tools. – Basel: BIS, January 2013.</w:t>
       </w:r>
     </w:p>
   </w:footnote>
   <w:footnote w:id="55">
+    <w:p>
+      <w:pPr>
+        <w:pStyle w:val="FootnoteText"/>
+      </w:pPr>
+      <w:r>
+        <w:rPr>
+          <w:rStyle w:val="FootnoteReference"/>
+        </w:rPr>
+        <w:footnoteRef/>
+      </w:r>
+      <w:r>
+        <w:t xml:space="preserve"> </w:t>
+      </w:r>
+      <w:r>
+        <w:t xml:space="preserve">Tadqiqot natijasida muallif tomonidan 2.3.4-jadval ma’lumotlari asosida ishlab chiqildi.</w:t>
+      </w:r>
+    </w:p>
+  </w:footnote>
+  <w:footnote w:id="56">
+    <w:p>
+      <w:pPr>
+        <w:pStyle w:val="FootnoteText"/>
+      </w:pPr>
+      <w:r>
+        <w:rPr>
+          <w:rStyle w:val="FootnoteReference"/>
+        </w:rPr>
+        <w:footnoteRef/>
+      </w:r>
+      <w:r>
+        <w:t xml:space="preserve"> </w:t>
+      </w:r>
+      <w:r>
+        <w:t xml:space="preserve">International Monetary Fund. Republic of Uzbekistan: Financial Sector Assessment Program – Financial System Stability Assessment. IMF Country Report No. 25/145. – Washington, DC: IMF, 2025.</w:t>
+      </w:r>
+    </w:p>
+  </w:footnote>
+  <w:footnote w:id="57">
     <w:p>
       <w:pPr>
         <w:pStyle w:val="FootnoteText"/>
@@ -11701,10 +12370,10 @@
                   <c:v>Jami aktivlar</c:v>
                 </c:pt>
                 <c:pt idx="4">
+                  <c:v>CET1 monandligi</c:v>
+                </c:pt>
+                <c:pt idx="5">
                   <c:v>Xususiy kapital</c:v>
-                </c:pt>
-                <c:pt idx="5">
-                  <c:v>CET1 monandligi</c:v>
                 </c:pt>
                 <c:pt idx="6">
                   <c:v>Sof foyda</c:v>
@@ -11731,10 +12400,10 @@
                   <c:v>-5.1</c:v>
                 </c:pt>
                 <c:pt idx="4">
+                  <c:v>-13.1</c:v>
+                </c:pt>
+                <c:pt idx="5">
                   <c:v>-13.5</c:v>
-                </c:pt>
-                <c:pt idx="5">
-                  <c:v>-16.7</c:v>
                 </c:pt>
                 <c:pt idx="6">
                   <c:v>-17.9</c:v>

</xml_diff>